<commit_message>
Chapter 12 & 13
</commit_message>
<xml_diff>
--- a/Chapter14/Chapter 14 Validation.docx
+++ b/Chapter14/Chapter 14 Validation.docx
@@ -22,7 +22,242 @@
         <w:t>n</w:t>
       </w:r>
     </w:p>
-    <w:p/>
+    <w:p>
+      <w:r>
+        <w:drawing>
+          <wp:inline distT="0" distB="0" distL="0" distR="0" wp14:anchorId="4D517276" wp14:editId="6643C5AB">
+            <wp:extent cx="5943600" cy="2697480"/>
+            <wp:effectExtent l="0" t="0" r="0" b="7620"/>
+            <wp:docPr id="1699122449" name="Picture 1"/>
+            <wp:cNvGraphicFramePr>
+              <a:graphicFrameLocks xmlns:a="http://schemas.openxmlformats.org/drawingml/2006/main" noChangeAspect="1"/>
+            </wp:cNvGraphicFramePr>
+            <a:graphic xmlns:a="http://schemas.openxmlformats.org/drawingml/2006/main">
+              <a:graphicData uri="http://schemas.openxmlformats.org/drawingml/2006/picture">
+                <pic:pic xmlns:pic="http://schemas.openxmlformats.org/drawingml/2006/picture">
+                  <pic:nvPicPr>
+                    <pic:cNvPr id="1699122449" name=""/>
+                    <pic:cNvPicPr/>
+                  </pic:nvPicPr>
+                  <pic:blipFill>
+                    <a:blip r:embed="rId4"/>
+                    <a:stretch>
+                      <a:fillRect/>
+                    </a:stretch>
+                  </pic:blipFill>
+                  <pic:spPr>
+                    <a:xfrm>
+                      <a:off x="0" y="0"/>
+                      <a:ext cx="5943600" cy="2697480"/>
+                    </a:xfrm>
+                    <a:prstGeom prst="rect">
+                      <a:avLst/>
+                    </a:prstGeom>
+                  </pic:spPr>
+                </pic:pic>
+              </a:graphicData>
+            </a:graphic>
+          </wp:inline>
+        </w:drawing>
+      </w:r>
+    </w:p>
+    <w:p>
+      <w:r>
+        <w:drawing>
+          <wp:inline distT="0" distB="0" distL="0" distR="0" wp14:anchorId="06CA56E2" wp14:editId="033DC036">
+            <wp:extent cx="5943600" cy="2634615"/>
+            <wp:effectExtent l="0" t="0" r="0" b="0"/>
+            <wp:docPr id="1133337985" name="Picture 1"/>
+            <wp:cNvGraphicFramePr>
+              <a:graphicFrameLocks xmlns:a="http://schemas.openxmlformats.org/drawingml/2006/main" noChangeAspect="1"/>
+            </wp:cNvGraphicFramePr>
+            <a:graphic xmlns:a="http://schemas.openxmlformats.org/drawingml/2006/main">
+              <a:graphicData uri="http://schemas.openxmlformats.org/drawingml/2006/picture">
+                <pic:pic xmlns:pic="http://schemas.openxmlformats.org/drawingml/2006/picture">
+                  <pic:nvPicPr>
+                    <pic:cNvPr id="1133337985" name=""/>
+                    <pic:cNvPicPr/>
+                  </pic:nvPicPr>
+                  <pic:blipFill>
+                    <a:blip r:embed="rId5"/>
+                    <a:stretch>
+                      <a:fillRect/>
+                    </a:stretch>
+                  </pic:blipFill>
+                  <pic:spPr>
+                    <a:xfrm>
+                      <a:off x="0" y="0"/>
+                      <a:ext cx="5943600" cy="2634615"/>
+                    </a:xfrm>
+                    <a:prstGeom prst="rect">
+                      <a:avLst/>
+                    </a:prstGeom>
+                  </pic:spPr>
+                </pic:pic>
+              </a:graphicData>
+            </a:graphic>
+          </wp:inline>
+        </w:drawing>
+      </w:r>
+    </w:p>
+    <w:p>
+      <w:r>
+        <w:lastRenderedPageBreak/>
+        <w:drawing>
+          <wp:inline distT="0" distB="0" distL="0" distR="0" wp14:anchorId="1BFBB9C1" wp14:editId="0312F089">
+            <wp:extent cx="5943600" cy="2933700"/>
+            <wp:effectExtent l="0" t="0" r="0" b="0"/>
+            <wp:docPr id="967892475" name="Picture 1"/>
+            <wp:cNvGraphicFramePr>
+              <a:graphicFrameLocks xmlns:a="http://schemas.openxmlformats.org/drawingml/2006/main" noChangeAspect="1"/>
+            </wp:cNvGraphicFramePr>
+            <a:graphic xmlns:a="http://schemas.openxmlformats.org/drawingml/2006/main">
+              <a:graphicData uri="http://schemas.openxmlformats.org/drawingml/2006/picture">
+                <pic:pic xmlns:pic="http://schemas.openxmlformats.org/drawingml/2006/picture">
+                  <pic:nvPicPr>
+                    <pic:cNvPr id="967892475" name=""/>
+                    <pic:cNvPicPr/>
+                  </pic:nvPicPr>
+                  <pic:blipFill>
+                    <a:blip r:embed="rId6"/>
+                    <a:stretch>
+                      <a:fillRect/>
+                    </a:stretch>
+                  </pic:blipFill>
+                  <pic:spPr>
+                    <a:xfrm>
+                      <a:off x="0" y="0"/>
+                      <a:ext cx="5943600" cy="2933700"/>
+                    </a:xfrm>
+                    <a:prstGeom prst="rect">
+                      <a:avLst/>
+                    </a:prstGeom>
+                  </pic:spPr>
+                </pic:pic>
+              </a:graphicData>
+            </a:graphic>
+          </wp:inline>
+        </w:drawing>
+      </w:r>
+    </w:p>
+    <w:p>
+      <w:r>
+        <w:drawing>
+          <wp:inline distT="0" distB="0" distL="0" distR="0" wp14:anchorId="5CA4D63E" wp14:editId="60904C08">
+            <wp:extent cx="5943600" cy="2933700"/>
+            <wp:effectExtent l="0" t="0" r="0" b="0"/>
+            <wp:docPr id="1076581737" name="Picture 1"/>
+            <wp:cNvGraphicFramePr>
+              <a:graphicFrameLocks xmlns:a="http://schemas.openxmlformats.org/drawingml/2006/main" noChangeAspect="1"/>
+            </wp:cNvGraphicFramePr>
+            <a:graphic xmlns:a="http://schemas.openxmlformats.org/drawingml/2006/main">
+              <a:graphicData uri="http://schemas.openxmlformats.org/drawingml/2006/picture">
+                <pic:pic xmlns:pic="http://schemas.openxmlformats.org/drawingml/2006/picture">
+                  <pic:nvPicPr>
+                    <pic:cNvPr id="1076581737" name=""/>
+                    <pic:cNvPicPr/>
+                  </pic:nvPicPr>
+                  <pic:blipFill>
+                    <a:blip r:embed="rId6"/>
+                    <a:stretch>
+                      <a:fillRect/>
+                    </a:stretch>
+                  </pic:blipFill>
+                  <pic:spPr>
+                    <a:xfrm>
+                      <a:off x="0" y="0"/>
+                      <a:ext cx="5943600" cy="2933700"/>
+                    </a:xfrm>
+                    <a:prstGeom prst="rect">
+                      <a:avLst/>
+                    </a:prstGeom>
+                  </pic:spPr>
+                </pic:pic>
+              </a:graphicData>
+            </a:graphic>
+          </wp:inline>
+        </w:drawing>
+      </w:r>
+    </w:p>
+    <w:p>
+      <w:r>
+        <w:lastRenderedPageBreak/>
+        <w:drawing>
+          <wp:inline distT="0" distB="0" distL="0" distR="0" wp14:anchorId="29C53BB6" wp14:editId="044C0CF6">
+            <wp:extent cx="5943600" cy="2828925"/>
+            <wp:effectExtent l="0" t="0" r="0" b="9525"/>
+            <wp:docPr id="605168457" name="Picture 1"/>
+            <wp:cNvGraphicFramePr>
+              <a:graphicFrameLocks xmlns:a="http://schemas.openxmlformats.org/drawingml/2006/main" noChangeAspect="1"/>
+            </wp:cNvGraphicFramePr>
+            <a:graphic xmlns:a="http://schemas.openxmlformats.org/drawingml/2006/main">
+              <a:graphicData uri="http://schemas.openxmlformats.org/drawingml/2006/picture">
+                <pic:pic xmlns:pic="http://schemas.openxmlformats.org/drawingml/2006/picture">
+                  <pic:nvPicPr>
+                    <pic:cNvPr id="605168457" name=""/>
+                    <pic:cNvPicPr/>
+                  </pic:nvPicPr>
+                  <pic:blipFill>
+                    <a:blip r:embed="rId7"/>
+                    <a:stretch>
+                      <a:fillRect/>
+                    </a:stretch>
+                  </pic:blipFill>
+                  <pic:spPr>
+                    <a:xfrm>
+                      <a:off x="0" y="0"/>
+                      <a:ext cx="5943600" cy="2828925"/>
+                    </a:xfrm>
+                    <a:prstGeom prst="rect">
+                      <a:avLst/>
+                    </a:prstGeom>
+                  </pic:spPr>
+                </pic:pic>
+              </a:graphicData>
+            </a:graphic>
+          </wp:inline>
+        </w:drawing>
+      </w:r>
+    </w:p>
+    <w:p>
+      <w:r>
+        <w:drawing>
+          <wp:inline distT="0" distB="0" distL="0" distR="0" wp14:anchorId="458783E0" wp14:editId="3B671D35">
+            <wp:extent cx="5943600" cy="3936365"/>
+            <wp:effectExtent l="0" t="0" r="0" b="6985"/>
+            <wp:docPr id="967081467" name="Picture 1"/>
+            <wp:cNvGraphicFramePr>
+              <a:graphicFrameLocks xmlns:a="http://schemas.openxmlformats.org/drawingml/2006/main" noChangeAspect="1"/>
+            </wp:cNvGraphicFramePr>
+            <a:graphic xmlns:a="http://schemas.openxmlformats.org/drawingml/2006/main">
+              <a:graphicData uri="http://schemas.openxmlformats.org/drawingml/2006/picture">
+                <pic:pic xmlns:pic="http://schemas.openxmlformats.org/drawingml/2006/picture">
+                  <pic:nvPicPr>
+                    <pic:cNvPr id="967081467" name=""/>
+                    <pic:cNvPicPr/>
+                  </pic:nvPicPr>
+                  <pic:blipFill>
+                    <a:blip r:embed="rId8"/>
+                    <a:stretch>
+                      <a:fillRect/>
+                    </a:stretch>
+                  </pic:blipFill>
+                  <pic:spPr>
+                    <a:xfrm>
+                      <a:off x="0" y="0"/>
+                      <a:ext cx="5943600" cy="3936365"/>
+                    </a:xfrm>
+                    <a:prstGeom prst="rect">
+                      <a:avLst/>
+                    </a:prstGeom>
+                  </pic:spPr>
+                </pic:pic>
+              </a:graphicData>
+            </a:graphic>
+          </wp:inline>
+        </w:drawing>
+      </w:r>
+    </w:p>
     <w:sectPr>
       <w:pgSz w:w="12240" w:h="15840"/>
       <w:pgMar w:top="1440" w:right="1440" w:bottom="1440" w:left="1440" w:header="720" w:footer="720" w:gutter="0"/>

</xml_diff>